<commit_message>
Updated REQ & DESIGN
</commit_message>
<xml_diff>
--- a/docs/Requirement_Specification.docx
+++ b/docs/Requirement_Specification.docx
@@ -15,7 +15,7 @@
         <w:pStyle w:val="Subtitle"/>
       </w:pPr>
       <w:r>
-        <w:t xml:space="preserve">TRUST Tech Deliverable 4a: Enable user GitLab &amp; Docker images</w:t>
+        <w:t xml:space="preserve">Enable user GitLab &amp; Docker images</w:t>
       </w:r>
     </w:p>
     <w:p>
@@ -94,24 +94,6 @@
     <w:p>
       <w:pPr>
         <w:pStyle w:val="FirstParagraph"/>
-      </w:pPr>
-      <w:r>
-        <w:rPr>
-          <w:b/>
-          <w:bCs/>
-        </w:rPr>
-        <w:t xml:space="preserve">Revision History</w:t>
-      </w:r>
-      <w:r>
-        <w:t xml:space="preserve"> </w:t>
-      </w:r>
-      <w:r>
-        <w:t xml:space="preserve">NA</w:t>
-      </w:r>
-    </w:p>
-    <w:p>
-      <w:pPr>
-        <w:pStyle w:val="BodyText"/>
       </w:pPr>
       <w:r>
         <w:rPr>
@@ -227,7 +209,7 @@
               <w:jc w:val="left"/>
             </w:pPr>
             <w:r>
-              <w:t xml:space="preserve">31 Jan 2025</w:t>
+              <w:t xml:space="preserve">30 Nov 2024</w:t>
             </w:r>
           </w:p>
         </w:tc>
@@ -351,7 +333,7 @@
               <w:jc w:val="left"/>
             </w:pPr>
             <w:r>
-              <w:t xml:space="preserve">31 Jan 2025</w:t>
+              <w:t xml:space="preserve">30 Nov 2024</w:t>
             </w:r>
           </w:p>
         </w:tc>
@@ -475,7 +457,7 @@
               <w:jc w:val="left"/>
             </w:pPr>
             <w:r>
-              <w:t xml:space="preserve">31 Jan 2025</w:t>
+              <w:t xml:space="preserve">30 Nov 2024</w:t>
             </w:r>
           </w:p>
         </w:tc>
@@ -521,7 +503,7 @@
               <w:jc w:val="left"/>
             </w:pPr>
             <w:r>
-              <w:t xml:space="preserve">31 Jan 2025</w:t>
+              <w:t xml:space="preserve">30 Nov 2024</w:t>
             </w:r>
           </w:p>
         </w:tc>
@@ -553,7 +535,7 @@
         </w:numPr>
       </w:pPr>
       <w:r>
-        <w:t xml:space="preserve">Introduction</w:t>
+        <w:t xml:space="preserve">INTRODUCTION</w:t>
       </w:r>
     </w:p>
     <w:p>
@@ -565,7 +547,55 @@
         </w:numPr>
       </w:pPr>
       <w:r>
-        <w:t xml:space="preserve">1.1 References</w:t>
+        <w:t xml:space="preserve">1.1 Document Purpose</w:t>
+      </w:r>
+    </w:p>
+    <w:p>
+      <w:pPr>
+        <w:pStyle w:val="Compact"/>
+        <w:numPr>
+          <w:ilvl w:val="1"/>
+          <w:numId w:val="1002"/>
+        </w:numPr>
+      </w:pPr>
+      <w:r>
+        <w:t xml:space="preserve">1.2 System Overview</w:t>
+      </w:r>
+    </w:p>
+    <w:p>
+      <w:pPr>
+        <w:pStyle w:val="Compact"/>
+        <w:numPr>
+          <w:ilvl w:val="1"/>
+          <w:numId w:val="1002"/>
+        </w:numPr>
+      </w:pPr>
+      <w:r>
+        <w:t xml:space="preserve">1.3 Project Objectives / Goals</w:t>
+      </w:r>
+    </w:p>
+    <w:p>
+      <w:pPr>
+        <w:pStyle w:val="Compact"/>
+        <w:numPr>
+          <w:ilvl w:val="1"/>
+          <w:numId w:val="1002"/>
+        </w:numPr>
+      </w:pPr>
+      <w:r>
+        <w:t xml:space="preserve">1.4 Definitions/Glossary</w:t>
+      </w:r>
+    </w:p>
+    <w:p>
+      <w:pPr>
+        <w:pStyle w:val="Compact"/>
+        <w:numPr>
+          <w:ilvl w:val="1"/>
+          <w:numId w:val="1002"/>
+        </w:numPr>
+      </w:pPr>
+      <w:r>
+        <w:t xml:space="preserve">1.5 References</w:t>
       </w:r>
     </w:p>
     <w:p>
@@ -577,7 +607,7 @@
         </w:numPr>
       </w:pPr>
       <w:r>
-        <w:t xml:space="preserve">Application Overview</w:t>
+        <w:t xml:space="preserve">FUNCTIONAL SPECIFICATION OVERVIEW</w:t>
       </w:r>
     </w:p>
     <w:p>
@@ -589,7 +619,7 @@
         </w:numPr>
       </w:pPr>
       <w:r>
-        <w:t xml:space="preserve">2.1 Layers or architectural framework</w:t>
+        <w:t xml:space="preserve">2.1 In-Scope</w:t>
       </w:r>
     </w:p>
     <w:p>
@@ -601,7 +631,7 @@
         </w:numPr>
       </w:pPr>
       <w:r>
-        <w:t xml:space="preserve">2.2 Deployment View</w:t>
+        <w:t xml:space="preserve">2.2 Out-of-Scope</w:t>
       </w:r>
     </w:p>
     <w:p>
@@ -613,7 +643,7 @@
         </w:numPr>
       </w:pPr>
       <w:r>
-        <w:t xml:space="preserve">2.3 Development View</w:t>
+        <w:t xml:space="preserve">2.3 Assumptions and Dependencies</w:t>
       </w:r>
     </w:p>
     <w:p>
@@ -625,7 +655,7 @@
         </w:numPr>
       </w:pPr>
       <w:r>
-        <w:t xml:space="preserve">2.4 Architectural Mechanisms</w:t>
+        <w:t xml:space="preserve">2.4 User Access</w:t>
       </w:r>
     </w:p>
     <w:p>
@@ -637,7 +667,31 @@
         </w:numPr>
       </w:pPr>
       <w:r>
-        <w:t xml:space="preserve">Architecturally significant requirements</w:t>
+        <w:t xml:space="preserve">WORKFLOWS</w:t>
+      </w:r>
+    </w:p>
+    <w:p>
+      <w:pPr>
+        <w:pStyle w:val="Compact"/>
+        <w:numPr>
+          <w:ilvl w:val="1"/>
+          <w:numId w:val="1004"/>
+        </w:numPr>
+      </w:pPr>
+      <w:r>
+        <w:t xml:space="preserve">3.1 Existing or “As-Is” Process Workflow</w:t>
+      </w:r>
+    </w:p>
+    <w:p>
+      <w:pPr>
+        <w:pStyle w:val="Compact"/>
+        <w:numPr>
+          <w:ilvl w:val="1"/>
+          <w:numId w:val="1004"/>
+        </w:numPr>
+      </w:pPr>
+      <w:r>
+        <w:t xml:space="preserve">3.2 Proposed or “To-Be” Process Workflow</w:t>
       </w:r>
     </w:p>
     <w:p>
@@ -649,7 +703,7 @@
         </w:numPr>
       </w:pPr>
       <w:r>
-        <w:t xml:space="preserve">Security</w:t>
+        <w:t xml:space="preserve">FUNCTIONAL REQUIREMENTS</w:t>
       </w:r>
     </w:p>
     <w:p>
@@ -657,11 +711,23 @@
         <w:pStyle w:val="Compact"/>
         <w:numPr>
           <w:ilvl w:val="1"/>
-          <w:numId w:val="1004"/>
+          <w:numId w:val="1005"/>
         </w:numPr>
       </w:pPr>
       <w:r>
-        <w:t xml:space="preserve">4.1 System Security</w:t>
+        <w:t xml:space="preserve">4.1 Statutory or Regulatory Requirements</w:t>
+      </w:r>
+    </w:p>
+    <w:p>
+      <w:pPr>
+        <w:pStyle w:val="Compact"/>
+        <w:numPr>
+          <w:ilvl w:val="2"/>
+          <w:numId w:val="1006"/>
+        </w:numPr>
+      </w:pPr>
+      <w:r>
+        <w:t xml:space="preserve">4.1.1 Personal Data Protection Act (PDPA)</w:t>
       </w:r>
     </w:p>
     <w:p>
@@ -669,11 +735,83 @@
         <w:pStyle w:val="Compact"/>
         <w:numPr>
           <w:ilvl w:val="1"/>
-          <w:numId w:val="1004"/>
+          <w:numId w:val="1005"/>
         </w:numPr>
       </w:pPr>
       <w:r>
-        <w:t xml:space="preserve">4.2 Data Security</w:t>
+        <w:t xml:space="preserve">4.2 &lt;Functional Requirement or Feature # 1&gt;</w:t>
+      </w:r>
+    </w:p>
+    <w:p>
+      <w:pPr>
+        <w:pStyle w:val="Compact"/>
+        <w:numPr>
+          <w:ilvl w:val="2"/>
+          <w:numId w:val="1007"/>
+        </w:numPr>
+      </w:pPr>
+      <w:r>
+        <w:t xml:space="preserve">4.2.1 Graphical User Interface</w:t>
+      </w:r>
+    </w:p>
+    <w:p>
+      <w:pPr>
+        <w:pStyle w:val="Compact"/>
+        <w:numPr>
+          <w:ilvl w:val="2"/>
+          <w:numId w:val="1007"/>
+        </w:numPr>
+      </w:pPr>
+      <w:r>
+        <w:t xml:space="preserve">4.2.2 Data Flow</w:t>
+      </w:r>
+    </w:p>
+    <w:p>
+      <w:pPr>
+        <w:pStyle w:val="Compact"/>
+        <w:numPr>
+          <w:ilvl w:val="2"/>
+          <w:numId w:val="1007"/>
+        </w:numPr>
+      </w:pPr>
+      <w:r>
+        <w:t xml:space="preserve">4.2.3 Process Flow</w:t>
+      </w:r>
+    </w:p>
+    <w:p>
+      <w:pPr>
+        <w:pStyle w:val="Compact"/>
+        <w:numPr>
+          <w:ilvl w:val="2"/>
+          <w:numId w:val="1007"/>
+        </w:numPr>
+      </w:pPr>
+      <w:r>
+        <w:t xml:space="preserve">4.2.4 Business Validation</w:t>
+      </w:r>
+    </w:p>
+    <w:p>
+      <w:pPr>
+        <w:pStyle w:val="Compact"/>
+        <w:numPr>
+          <w:ilvl w:val="2"/>
+          <w:numId w:val="1007"/>
+        </w:numPr>
+      </w:pPr>
+      <w:r>
+        <w:t xml:space="preserve">4.2.5 Data Validation</w:t>
+      </w:r>
+    </w:p>
+    <w:p>
+      <w:pPr>
+        <w:pStyle w:val="Compact"/>
+        <w:numPr>
+          <w:ilvl w:val="2"/>
+          <w:numId w:val="1007"/>
+        </w:numPr>
+      </w:pPr>
+      <w:r>
+        <w:t xml:space="preserve">4.2.6 Reports/print-outs</w:t>
       </w:r>
     </w:p>
     <w:p>
@@ -681,11 +819,83 @@
         <w:pStyle w:val="Compact"/>
         <w:numPr>
           <w:ilvl w:val="1"/>
-          <w:numId w:val="1004"/>
+          <w:numId w:val="1005"/>
         </w:numPr>
       </w:pPr>
       <w:r>
-        <w:t xml:space="preserve">4.3 Application Security</w:t>
+        <w:t xml:space="preserve">4.3 &lt;Functional Requirement or Feature # 2&gt;</w:t>
+      </w:r>
+    </w:p>
+    <w:p>
+      <w:pPr>
+        <w:pStyle w:val="Compact"/>
+        <w:numPr>
+          <w:ilvl w:val="2"/>
+          <w:numId w:val="1008"/>
+        </w:numPr>
+      </w:pPr>
+      <w:r>
+        <w:t xml:space="preserve">4.3.1 Graphical User Interface</w:t>
+      </w:r>
+    </w:p>
+    <w:p>
+      <w:pPr>
+        <w:pStyle w:val="Compact"/>
+        <w:numPr>
+          <w:ilvl w:val="2"/>
+          <w:numId w:val="1008"/>
+        </w:numPr>
+      </w:pPr>
+      <w:r>
+        <w:t xml:space="preserve">4.3.2 Data Flow</w:t>
+      </w:r>
+    </w:p>
+    <w:p>
+      <w:pPr>
+        <w:pStyle w:val="Compact"/>
+        <w:numPr>
+          <w:ilvl w:val="2"/>
+          <w:numId w:val="1008"/>
+        </w:numPr>
+      </w:pPr>
+      <w:r>
+        <w:t xml:space="preserve">4.3.3 Process Flow</w:t>
+      </w:r>
+    </w:p>
+    <w:p>
+      <w:pPr>
+        <w:pStyle w:val="Compact"/>
+        <w:numPr>
+          <w:ilvl w:val="2"/>
+          <w:numId w:val="1008"/>
+        </w:numPr>
+      </w:pPr>
+      <w:r>
+        <w:t xml:space="preserve">4.3.4 Business Validation</w:t>
+      </w:r>
+    </w:p>
+    <w:p>
+      <w:pPr>
+        <w:pStyle w:val="Compact"/>
+        <w:numPr>
+          <w:ilvl w:val="2"/>
+          <w:numId w:val="1008"/>
+        </w:numPr>
+      </w:pPr>
+      <w:r>
+        <w:t xml:space="preserve">4.3.5 Data Validation</w:t>
+      </w:r>
+    </w:p>
+    <w:p>
+      <w:pPr>
+        <w:pStyle w:val="Compact"/>
+        <w:numPr>
+          <w:ilvl w:val="2"/>
+          <w:numId w:val="1008"/>
+        </w:numPr>
+      </w:pPr>
+      <w:r>
+        <w:t xml:space="preserve">4.3.6 Reports/print-outs</w:t>
       </w:r>
     </w:p>
     <w:p>
@@ -697,7 +907,31 @@
         </w:numPr>
       </w:pPr>
       <w:r>
-        <w:t xml:space="preserve">Common Modules:</w:t>
+        <w:t xml:space="preserve">DATA SETUP</w:t>
+      </w:r>
+    </w:p>
+    <w:p>
+      <w:pPr>
+        <w:pStyle w:val="Compact"/>
+        <w:numPr>
+          <w:ilvl w:val="1"/>
+          <w:numId w:val="1009"/>
+        </w:numPr>
+      </w:pPr>
+      <w:r>
+        <w:t xml:space="preserve">5.1 &lt;Example 1 – Patient Race&gt;</w:t>
+      </w:r>
+    </w:p>
+    <w:p>
+      <w:pPr>
+        <w:pStyle w:val="Compact"/>
+        <w:numPr>
+          <w:ilvl w:val="1"/>
+          <w:numId w:val="1009"/>
+        </w:numPr>
+      </w:pPr>
+      <w:r>
+        <w:t xml:space="preserve">5.2 &lt;Example 2 – Relationship&gt;</w:t>
       </w:r>
     </w:p>
     <w:p>
@@ -709,7 +943,7 @@
         </w:numPr>
       </w:pPr>
       <w:r>
-        <w:t xml:space="preserve">Functional Modules:</w:t>
+        <w:t xml:space="preserve">RECONCILIATION REPORTS</w:t>
       </w:r>
     </w:p>
     <w:p>
@@ -721,7 +955,7 @@
         </w:numPr>
       </w:pPr>
       <w:r>
-        <w:t xml:space="preserve">Message / Service Interface:</w:t>
+        <w:t xml:space="preserve">BATCH JOBS</w:t>
       </w:r>
     </w:p>
     <w:p>
@@ -733,7 +967,7 @@
         </w:numPr>
       </w:pPr>
       <w:r>
-        <w:t xml:space="preserve">Database Design:</w:t>
+        <w:t xml:space="preserve">AUDIT LOGGING</w:t>
       </w:r>
     </w:p>
     <w:p>
@@ -745,30 +979,7 @@
         </w:numPr>
       </w:pPr>
       <w:r>
-        <w:t xml:space="preserve">Appendix A:</w:t>
-      </w:r>
-    </w:p>
-    <w:p>
-      <w:r>
-        <w:br w:type="page"/>
-      </w:r>
-    </w:p>
-    <w:bookmarkStart w:id="22" w:name="Xe3d0fc0bea9a42ce7605565d0964033d7f6ee47"/>
-    <w:p>
-      <w:pPr>
-        <w:pStyle w:val="Heading2"/>
-      </w:pPr>
-      <w:r>
-        <w:t xml:space="preserve">1. Introduction</w:t>
-      </w:r>
-    </w:p>
-    <w:bookmarkStart w:id="20" w:name="X726793783ba4ae7f9802481ba226d33bdbc715c"/>
-    <w:p>
-      <w:pPr>
-        <w:pStyle w:val="Heading3"/>
-      </w:pPr>
-      <w:r>
-        <w:t xml:space="preserve">1.1 References</w:t>
+        <w:t xml:space="preserve">DATA MIGRATION REQUIREMENTS</w:t>
       </w:r>
     </w:p>
     <w:p>
@@ -776,11 +987,11 @@
         <w:pStyle w:val="Compact"/>
         <w:numPr>
           <w:ilvl w:val="0"/>
-          <w:numId w:val="1005"/>
+          <w:numId w:val="1001"/>
         </w:numPr>
       </w:pPr>
       <w:r>
-        <w:t xml:space="preserve">GovTech GCC Security Guidelines</w:t>
+        <w:t xml:space="preserve">INTERFACE REQUIREMENTS</w:t>
       </w:r>
     </w:p>
     <w:p>
@@ -788,236 +999,11 @@
         <w:pStyle w:val="Compact"/>
         <w:numPr>
           <w:ilvl w:val="0"/>
-          <w:numId w:val="1005"/>
+          <w:numId w:val="1001"/>
         </w:numPr>
       </w:pPr>
       <w:r>
-        <w:t xml:space="preserve">AWS Best Practices for Multi-Account Strategy</w:t>
-      </w:r>
-    </w:p>
-    <w:bookmarkEnd w:id="20"/>
-    <w:bookmarkStart w:id="21" w:name="X49ed9524d92953ed1fe989ba0ae59a1c734e57e"/>
-    <w:p>
-      <w:pPr>
-        <w:pStyle w:val="Heading3"/>
-      </w:pPr>
-      <w:r>
-        <w:t xml:space="preserve">1.2 Abstract</w:t>
-      </w:r>
-    </w:p>
-    <w:p>
-      <w:pPr>
-        <w:pStyle w:val="FirstParagraph"/>
-      </w:pPr>
-      <w:r>
-        <w:t xml:space="preserve">This document defines the requirement specifications for deploying code,</w:t>
-      </w:r>
-      <w:r>
-        <w:t xml:space="preserve"> </w:t>
-      </w:r>
-      <w:r>
-        <w:t xml:space="preserve">container repositories, and related cloud infrastructure in a non-internet</w:t>
-      </w:r>
-      <w:r>
-        <w:t xml:space="preserve"> </w:t>
-      </w:r>
-      <w:r>
-        <w:t xml:space="preserve">environment (Singapore GCC) for Lifebit CloudOS, focusing on enabling</w:t>
-      </w:r>
-      <w:r>
-        <w:t xml:space="preserve"> </w:t>
-      </w:r>
-      <w:r>
-        <w:t xml:space="preserve">private GitLab and AWS ECR usage.</w:t>
-      </w:r>
-    </w:p>
-    <w:bookmarkEnd w:id="21"/>
-    <w:bookmarkEnd w:id="22"/>
-    <w:bookmarkStart w:id="27" w:name="Xf9f34b5ade7b74246e25285811a1147e91057fd"/>
-    <w:p>
-      <w:pPr>
-        <w:pStyle w:val="Heading2"/>
-      </w:pPr>
-      <w:r>
-        <w:t xml:space="preserve">2. Application Overview</w:t>
-      </w:r>
-    </w:p>
-    <w:bookmarkStart w:id="23" w:name="Xe0a06361bc86e7a2928b678f33ca0f033c13895"/>
-    <w:p>
-      <w:pPr>
-        <w:pStyle w:val="Heading3"/>
-      </w:pPr>
-      <w:r>
-        <w:t xml:space="preserve">2.1 Layers or architectural framework</w:t>
-      </w:r>
-    </w:p>
-    <w:p>
-      <w:pPr>
-        <w:pStyle w:val="FirstParagraph"/>
-      </w:pPr>
-      <w:r>
-        <w:t xml:space="preserve">The solution follows a multi-account AWS architecture for hosting CloudOS and related infrastructure components:</w:t>
-      </w:r>
-    </w:p>
-    <w:p>
-      <w:pPr>
-        <w:pStyle w:val="Compact"/>
-        <w:numPr>
-          <w:ilvl w:val="0"/>
-          <w:numId w:val="1006"/>
-        </w:numPr>
-      </w:pPr>
-      <w:r>
-        <w:t xml:space="preserve">AWS Service Account: Hosts CloudOS and GitLab Server for private code repositories.</w:t>
-      </w:r>
-    </w:p>
-    <w:p>
-      <w:pPr>
-        <w:pStyle w:val="Compact"/>
-        <w:numPr>
-          <w:ilvl w:val="0"/>
-          <w:numId w:val="1006"/>
-        </w:numPr>
-      </w:pPr>
-      <w:r>
-        <w:t xml:space="preserve">AWS Workload Account: Hosts AWS Batch and AWS ECR for containerized workload execution.</w:t>
-      </w:r>
-    </w:p>
-    <w:bookmarkEnd w:id="23"/>
-    <w:bookmarkStart w:id="24" w:name="X6f8fee67925bc380eefccd3a8794a4839d42803"/>
-    <w:p>
-      <w:pPr>
-        <w:pStyle w:val="Heading3"/>
-      </w:pPr>
-      <w:r>
-        <w:t xml:space="preserve">2.2 Deployment View</w:t>
-      </w:r>
-    </w:p>
-    <w:p>
-      <w:pPr>
-        <w:pStyle w:val="Compact"/>
-        <w:numPr>
-          <w:ilvl w:val="0"/>
-          <w:numId w:val="1007"/>
-        </w:numPr>
-      </w:pPr>
-      <w:r>
-        <w:t xml:space="preserve">GitLab Server: Deployed in the AWS Service Account, configured for private access.</w:t>
-      </w:r>
-    </w:p>
-    <w:p>
-      <w:pPr>
-        <w:pStyle w:val="Compact"/>
-        <w:numPr>
-          <w:ilvl w:val="0"/>
-          <w:numId w:val="1007"/>
-        </w:numPr>
-      </w:pPr>
-      <w:r>
-        <w:t xml:space="preserve">AWS ECR: Deployed in the AWS Workload Account, accessible only within AWS GCC accounts.</w:t>
-      </w:r>
-    </w:p>
-    <w:p>
-      <w:pPr>
-        <w:pStyle w:val="Compact"/>
-        <w:numPr>
-          <w:ilvl w:val="0"/>
-          <w:numId w:val="1007"/>
-        </w:numPr>
-      </w:pPr>
-      <w:r>
-        <w:t xml:space="preserve">AWS Batch: Utilized for running containerized jobs, with required IAM permissions.</w:t>
-      </w:r>
-    </w:p>
-    <w:bookmarkEnd w:id="24"/>
-    <w:bookmarkStart w:id="25" w:name="X3794f7dca5f99f11e320ee3657478fc26014f22"/>
-    <w:p>
-      <w:pPr>
-        <w:pStyle w:val="Heading3"/>
-      </w:pPr>
-      <w:r>
-        <w:t xml:space="preserve">2.3 Development View</w:t>
-      </w:r>
-    </w:p>
-    <w:p>
-      <w:pPr>
-        <w:pStyle w:val="Compact"/>
-        <w:numPr>
-          <w:ilvl w:val="0"/>
-          <w:numId w:val="1008"/>
-        </w:numPr>
-      </w:pPr>
-      <w:r>
-        <w:t xml:space="preserve">GitLab provides private repository hosting for researchers and engineers.</w:t>
-      </w:r>
-    </w:p>
-    <w:p>
-      <w:pPr>
-        <w:pStyle w:val="Compact"/>
-        <w:numPr>
-          <w:ilvl w:val="0"/>
-          <w:numId w:val="1008"/>
-        </w:numPr>
-      </w:pPr>
-      <w:r>
-        <w:t xml:space="preserve">CI/CD workflows will be managed within GitLab to integrate with AWS Batch.</w:t>
-      </w:r>
-    </w:p>
-    <w:p>
-      <w:pPr>
-        <w:pStyle w:val="Compact"/>
-        <w:numPr>
-          <w:ilvl w:val="0"/>
-          <w:numId w:val="1008"/>
-        </w:numPr>
-      </w:pPr>
-      <w:r>
-        <w:t xml:space="preserve">AWS ECR will store and manage private container images for workloads.</w:t>
-      </w:r>
-    </w:p>
-    <w:bookmarkEnd w:id="25"/>
-    <w:bookmarkStart w:id="26" w:name="Xf25b1b57c7cd717bbba5943214a02144c1c346a"/>
-    <w:p>
-      <w:pPr>
-        <w:pStyle w:val="Heading3"/>
-      </w:pPr>
-      <w:r>
-        <w:t xml:space="preserve">2.4 Architectural Mechanisms</w:t>
-      </w:r>
-    </w:p>
-    <w:p>
-      <w:pPr>
-        <w:pStyle w:val="Compact"/>
-        <w:numPr>
-          <w:ilvl w:val="0"/>
-          <w:numId w:val="1009"/>
-        </w:numPr>
-      </w:pPr>
-      <w:r>
-        <w:t xml:space="preserve">Secure networking between AWS accounts using VPC peering or AWS PrivateLink.</w:t>
-      </w:r>
-    </w:p>
-    <w:p>
-      <w:pPr>
-        <w:pStyle w:val="Compact"/>
-        <w:numPr>
-          <w:ilvl w:val="0"/>
-          <w:numId w:val="1009"/>
-        </w:numPr>
-      </w:pPr>
-      <w:r>
-        <w:t xml:space="preserve">IAM roles and policies restricting access to only necessary resources.</w:t>
-      </w:r>
-    </w:p>
-    <w:bookmarkEnd w:id="26"/>
-    <w:bookmarkEnd w:id="27"/>
-    <w:bookmarkStart w:id="28" w:name="X8fe8c93c5df41aa6082d521fbc27eeb07124af8"/>
-    <w:p>
-      <w:pPr>
-        <w:pStyle w:val="Heading2"/>
-      </w:pPr>
-      <w:r>
-        <w:t xml:space="preserve">3. Architecturally significant requirements</w:t>
+        <w:t xml:space="preserve">PERFORMANCE REQUIREMENTS</w:t>
       </w:r>
     </w:p>
     <w:p>
@@ -1029,7 +1015,7 @@
         </w:numPr>
       </w:pPr>
       <w:r>
-        <w:t xml:space="preserve">Deployment in a non-internet environment within Singapore GCC.</w:t>
+        <w:t xml:space="preserve">11.1 System Criticality &amp; Availability</w:t>
       </w:r>
     </w:p>
     <w:p>
@@ -1041,38 +1027,7 @@
         </w:numPr>
       </w:pPr>
       <w:r>
-        <w:t xml:space="preserve">Secure and private access for all services.</w:t>
-      </w:r>
-    </w:p>
-    <w:p>
-      <w:pPr>
-        <w:pStyle w:val="Compact"/>
-        <w:numPr>
-          <w:ilvl w:val="0"/>
-          <w:numId w:val="1010"/>
-        </w:numPr>
-      </w:pPr>
-      <w:r>
-        <w:t xml:space="preserve">Multi-account strategy for isolation and compliance.</w:t>
-      </w:r>
-    </w:p>
-    <w:bookmarkEnd w:id="28"/>
-    <w:bookmarkStart w:id="32" w:name="Xcd216216200afb0703e898683a8d10359544695"/>
-    <w:p>
-      <w:pPr>
-        <w:pStyle w:val="Heading2"/>
-      </w:pPr>
-      <w:r>
-        <w:t xml:space="preserve">4. Security</w:t>
-      </w:r>
-    </w:p>
-    <w:bookmarkStart w:id="29" w:name="X40afea54190d999a755ae224bb7bde31ba28fef"/>
-    <w:p>
-      <w:pPr>
-        <w:pStyle w:val="Heading3"/>
-      </w:pPr>
-      <w:r>
-        <w:t xml:space="preserve">4.1 System Security</w:t>
+        <w:t xml:space="preserve">11.2 Response Time</w:t>
       </w:r>
     </w:p>
     <w:p>
@@ -1084,29 +1039,82 @@
         </w:numPr>
       </w:pPr>
       <w:r>
-        <w:t xml:space="preserve">Network access controls enforced via Security Groups and VPC.</w:t>
-      </w:r>
-    </w:p>
-    <w:p>
-      <w:pPr>
-        <w:pStyle w:val="Compact"/>
-        <w:numPr>
-          <w:ilvl w:val="0"/>
-          <w:numId w:val="1011"/>
-        </w:numPr>
-      </w:pPr>
-      <w:r>
-        <w:t xml:space="preserve">AWS KMS for encrypting sensitive data and images.</w:t>
-      </w:r>
-    </w:p>
-    <w:bookmarkEnd w:id="29"/>
-    <w:bookmarkStart w:id="30" w:name="X4edf851e1126629320679d00e93d58ace42779c"/>
+        <w:t xml:space="preserve">SUMMARY / RECOMMENDATIONS</w:t>
+      </w:r>
+      <w:r>
+        <w:t xml:space="preserve"> </w:t>
+      </w:r>
+      <w:r>
+        <w:t xml:space="preserve">APPENDIX A</w:t>
+      </w:r>
+      <w:r>
+        <w:t xml:space="preserve"> </w:t>
+      </w:r>
+    </w:p>
+    <w:p>
+      <w:r>
+        <w:pict>
+          <v:rect style="width:0;height:1.5pt" o:hralign="center" o:hrstd="t" o:hr="t"/>
+        </w:pict>
+      </w:r>
+    </w:p>
+    <w:p>
+      <w:r>
+        <w:br w:type="page"/>
+      </w:r>
+    </w:p>
+    <w:bookmarkStart w:id="25" w:name="Xe3d0fc0bea9a42ce7605565d0964033d7f6ee47"/>
     <w:p>
       <w:pPr>
         <w:pStyle w:val="Heading3"/>
       </w:pPr>
       <w:r>
-        <w:t xml:space="preserve">4.2 Data Security</w:t>
+        <w:t xml:space="preserve">1. INTRODUCTION</w:t>
+      </w:r>
+    </w:p>
+    <w:bookmarkStart w:id="20" w:name="X4538b6a07fc99daf59a83447819ae27a633009c"/>
+    <w:p>
+      <w:pPr>
+        <w:pStyle w:val="Heading4"/>
+      </w:pPr>
+      <w:r>
+        <w:t xml:space="preserve">1.1 Document Purpose</w:t>
+      </w:r>
+    </w:p>
+    <w:p>
+      <w:pPr>
+        <w:pStyle w:val="FirstParagraph"/>
+      </w:pPr>
+      <w:r>
+        <w:t xml:space="preserve">This document defines the requirement specifications for deploying code, container repositories, and related cloud infrastructure in a non-internet environment within Singapore Government on Commercial Cloud (GCC) by GovTech. The project aims to enable private repository hosting, pipeline execution, and container management for Lifebit CloudOS workflows.</w:t>
+      </w:r>
+    </w:p>
+    <w:bookmarkEnd w:id="20"/>
+    <w:bookmarkStart w:id="21" w:name="Xd532870f8902deccbfa025c6fd9c427e622d25f"/>
+    <w:p>
+      <w:pPr>
+        <w:pStyle w:val="Heading4"/>
+      </w:pPr>
+      <w:r>
+        <w:t xml:space="preserve">1.2 System Overview</w:t>
+      </w:r>
+    </w:p>
+    <w:p>
+      <w:pPr>
+        <w:pStyle w:val="FirstParagraph"/>
+      </w:pPr>
+      <w:r>
+        <w:rPr>
+          <w:b/>
+          <w:bCs/>
+        </w:rPr>
+        <w:t xml:space="preserve">Tech Deliverable</w:t>
+      </w:r>
+      <w:r>
+        <w:br/>
+      </w:r>
+      <w:r>
+        <w:t xml:space="preserve">4a. Enable Lifebit users to run their own codes</w:t>
       </w:r>
     </w:p>
     <w:p>
@@ -1118,7 +1126,7 @@
         </w:numPr>
       </w:pPr>
       <w:r>
-        <w:t xml:space="preserve">No external data access permitted; all data resides within AWS GCC.</w:t>
+        <w:t xml:space="preserve">Phase 1 – Setup repositories (GitLab and AWS ECR) for hosting, accessing &amp; managing private Docker tools &amp; scripts/codes</w:t>
       </w:r>
     </w:p>
     <w:p>
@@ -1130,17 +1138,53 @@
         </w:numPr>
       </w:pPr>
       <w:r>
-        <w:t xml:space="preserve">Private container images stored in AWS ECR with strict access policies.</w:t>
-      </w:r>
-    </w:p>
-    <w:bookmarkEnd w:id="30"/>
-    <w:bookmarkStart w:id="31" w:name="Xfe56f53056fc040bc62ab1057abf108c1f214b6"/>
-    <w:p>
-      <w:pPr>
-        <w:pStyle w:val="Heading3"/>
-      </w:pPr>
-      <w:r>
-        <w:t xml:space="preserve">4.3 Application Security</w:t>
+        <w:t xml:space="preserve">Phase 2 – Setup to support hosting, accessing &amp; managing NextFlow pipeline</w:t>
+      </w:r>
+    </w:p>
+    <w:p>
+      <w:pPr>
+        <w:pStyle w:val="FirstParagraph"/>
+      </w:pPr>
+      <w:r>
+        <w:rPr>
+          <w:b/>
+          <w:bCs/>
+        </w:rPr>
+        <w:t xml:space="preserve">Problem Statement</w:t>
+      </w:r>
+      <w:r>
+        <w:br/>
+      </w:r>
+      <w:r>
+        <w:t xml:space="preserve">Currently, there is no version control repository available within the TRUST-Lifebit platform where researchers can host their custom codes and pipelines.</w:t>
+      </w:r>
+    </w:p>
+    <w:p>
+      <w:pPr>
+        <w:pStyle w:val="BodyText"/>
+      </w:pPr>
+      <w:r>
+        <w:rPr>
+          <w:b/>
+          <w:bCs/>
+        </w:rPr>
+        <w:t xml:space="preserve">Outcome</w:t>
+      </w:r>
+      <w:r>
+        <w:br/>
+      </w:r>
+      <w:r>
+        <w:t xml:space="preserve">CloudOS user can securely access and perform version control and collaborate with fellow researchers of their private codes, docker tools, and pipelines using Gitlab account and docker images using AWS ECR.</w:t>
+      </w:r>
+    </w:p>
+    <w:bookmarkEnd w:id="21"/>
+    <w:bookmarkStart w:id="22" w:name="Xb99c178ed437158699b02a1940cefdf3a011ef5"/>
+    <w:p>
+      <w:pPr>
+        <w:pStyle w:val="Heading4"/>
+      </w:pPr>
+      <w:r>
+        <w:t xml:space="preserve">1.3 Project Objectives / Goals</w:t>
       </w:r>
     </w:p>
     <w:p>
@@ -1152,7 +1196,7 @@
         </w:numPr>
       </w:pPr>
       <w:r>
-        <w:t xml:space="preserve">GitLab access restricted to authorized users only.</w:t>
+        <w:t xml:space="preserve">Enable private code and container repository hosting within a closed cloud environment.</w:t>
       </w:r>
     </w:p>
     <w:p>
@@ -1164,18 +1208,29 @@
         </w:numPr>
       </w:pPr>
       <w:r>
-        <w:t xml:space="preserve">IAM roles configured for least privilege access.</w:t>
-      </w:r>
-    </w:p>
-    <w:bookmarkEnd w:id="31"/>
-    <w:bookmarkEnd w:id="32"/>
-    <w:bookmarkStart w:id="33" w:name="X20e10987cdc8307bd731f09aee2bd57639ece92"/>
-    <w:p>
-      <w:pPr>
-        <w:pStyle w:val="Heading2"/>
-      </w:pPr>
-      <w:r>
-        <w:t xml:space="preserve">5. Common Modules</w:t>
+        <w:t xml:space="preserve">Provide a scalable and secure solution for pipeline execution and container management.</w:t>
+      </w:r>
+    </w:p>
+    <w:p>
+      <w:pPr>
+        <w:pStyle w:val="Compact"/>
+        <w:numPr>
+          <w:ilvl w:val="0"/>
+          <w:numId w:val="1013"/>
+        </w:numPr>
+      </w:pPr>
+      <w:r>
+        <w:t xml:space="preserve">Ensure compliance with regulatory and security requirements.</w:t>
+      </w:r>
+    </w:p>
+    <w:bookmarkEnd w:id="22"/>
+    <w:bookmarkStart w:id="23" w:name="X7ac3161869c040708d55cfcfef94cccd922d3bd"/>
+    <w:p>
+      <w:pPr>
+        <w:pStyle w:val="Heading4"/>
+      </w:pPr>
+      <w:r>
+        <w:t xml:space="preserve">1.4 Definitions/Glossary</w:t>
       </w:r>
     </w:p>
     <w:p>
@@ -1187,17 +1242,81 @@
         </w:numPr>
       </w:pPr>
       <w:r>
-        <w:t xml:space="preserve">NA</w:t>
-      </w:r>
-    </w:p>
-    <w:bookmarkEnd w:id="33"/>
-    <w:bookmarkStart w:id="34" w:name="X1e2aaa9011dae236aafe7db6cfa8a50736588a6"/>
-    <w:p>
-      <w:pPr>
-        <w:pStyle w:val="Heading2"/>
-      </w:pPr>
-      <w:r>
-        <w:t xml:space="preserve">6. Functional Modules</w:t>
+        <w:rPr>
+          <w:b/>
+          <w:bCs/>
+        </w:rPr>
+        <w:t xml:space="preserve">GitLab Server</w:t>
+      </w:r>
+      <w:r>
+        <w:t xml:space="preserve">: Self-hosted version of GitLab for code repository management.</w:t>
+      </w:r>
+    </w:p>
+    <w:p>
+      <w:pPr>
+        <w:pStyle w:val="Compact"/>
+        <w:numPr>
+          <w:ilvl w:val="0"/>
+          <w:numId w:val="1014"/>
+        </w:numPr>
+      </w:pPr>
+      <w:r>
+        <w:rPr>
+          <w:b/>
+          <w:bCs/>
+        </w:rPr>
+        <w:t xml:space="preserve">AWS ECR</w:t>
+      </w:r>
+      <w:r>
+        <w:t xml:space="preserve">: Private container image repository for storing and managing Docker images.</w:t>
+      </w:r>
+    </w:p>
+    <w:p>
+      <w:pPr>
+        <w:pStyle w:val="Compact"/>
+        <w:numPr>
+          <w:ilvl w:val="0"/>
+          <w:numId w:val="1014"/>
+        </w:numPr>
+      </w:pPr>
+      <w:r>
+        <w:rPr>
+          <w:b/>
+          <w:bCs/>
+        </w:rPr>
+        <w:t xml:space="preserve">AWS Batch</w:t>
+      </w:r>
+      <w:r>
+        <w:t xml:space="preserve">: Managed batch processing service for running containerized workloads.</w:t>
+      </w:r>
+    </w:p>
+    <w:p>
+      <w:pPr>
+        <w:pStyle w:val="Compact"/>
+        <w:numPr>
+          <w:ilvl w:val="0"/>
+          <w:numId w:val="1014"/>
+        </w:numPr>
+      </w:pPr>
+      <w:r>
+        <w:rPr>
+          <w:b/>
+          <w:bCs/>
+        </w:rPr>
+        <w:t xml:space="preserve">CloudOS</w:t>
+      </w:r>
+      <w:r>
+        <w:t xml:space="preserve">: Lifebit’s cloud-native bioinformatics platform.</w:t>
+      </w:r>
+    </w:p>
+    <w:bookmarkEnd w:id="23"/>
+    <w:bookmarkStart w:id="24" w:name="Xcb8f34702d1980450cb726f50d1fbc110147fb8"/>
+    <w:p>
+      <w:pPr>
+        <w:pStyle w:val="Heading4"/>
+      </w:pPr>
+      <w:r>
+        <w:t xml:space="preserve">1.5 References</w:t>
       </w:r>
     </w:p>
     <w:p>
@@ -1209,17 +1328,46 @@
         </w:numPr>
       </w:pPr>
       <w:r>
-        <w:t xml:space="preserve">NA</w:t>
-      </w:r>
-    </w:p>
-    <w:bookmarkEnd w:id="34"/>
-    <w:bookmarkStart w:id="35" w:name="X1d4bc5783fc24fef6fef0eaf46f0700211dae34"/>
-    <w:p>
-      <w:pPr>
-        <w:pStyle w:val="Heading2"/>
-      </w:pPr>
-      <w:r>
-        <w:t xml:space="preserve">7. Message / Service Interface</w:t>
+        <w:t xml:space="preserve">GovTech GCC Documentation</w:t>
+      </w:r>
+    </w:p>
+    <w:p>
+      <w:pPr>
+        <w:pStyle w:val="Compact"/>
+        <w:numPr>
+          <w:ilvl w:val="0"/>
+          <w:numId w:val="1015"/>
+        </w:numPr>
+      </w:pPr>
+      <w:r>
+        <w:t xml:space="preserve">AWS Security Best Practices</w:t>
+      </w:r>
+    </w:p>
+    <w:p>
+      <w:r>
+        <w:pict>
+          <v:rect style="width:0;height:1.5pt" o:hralign="center" o:hrstd="t" o:hr="t"/>
+        </w:pict>
+      </w:r>
+    </w:p>
+    <w:bookmarkEnd w:id="24"/>
+    <w:bookmarkEnd w:id="25"/>
+    <w:bookmarkStart w:id="30" w:name="X8a2f750c376c4080b7efb02cd32659e2adb7004"/>
+    <w:p>
+      <w:pPr>
+        <w:pStyle w:val="Heading3"/>
+      </w:pPr>
+      <w:r>
+        <w:t xml:space="preserve">2. FUNCTIONAL SPECIFICATION OVERVIEW</w:t>
+      </w:r>
+    </w:p>
+    <w:bookmarkStart w:id="26" w:name="Xee9968e576af67a8624d7c47cdba3f79151f5d9"/>
+    <w:p>
+      <w:pPr>
+        <w:pStyle w:val="Heading4"/>
+      </w:pPr>
+      <w:r>
+        <w:t xml:space="preserve">2.1 In-Scope</w:t>
       </w:r>
     </w:p>
     <w:p>
@@ -1231,17 +1379,41 @@
         </w:numPr>
       </w:pPr>
       <w:r>
-        <w:t xml:space="preserve">NA</w:t>
-      </w:r>
-    </w:p>
-    <w:bookmarkEnd w:id="35"/>
-    <w:bookmarkStart w:id="36" w:name="Xf39b8f1f42479e81da005ed623c5066659178f6"/>
-    <w:p>
-      <w:pPr>
-        <w:pStyle w:val="Heading2"/>
-      </w:pPr>
-      <w:r>
-        <w:t xml:space="preserve">8. Database Design</w:t>
+        <w:t xml:space="preserve">Setup a self-hosted GitLab server within the CloudOS environment.</w:t>
+      </w:r>
+    </w:p>
+    <w:p>
+      <w:pPr>
+        <w:pStyle w:val="Compact"/>
+        <w:numPr>
+          <w:ilvl w:val="0"/>
+          <w:numId w:val="1016"/>
+        </w:numPr>
+      </w:pPr>
+      <w:r>
+        <w:t xml:space="preserve">Setup of AWS ECR in a separate AWS GCC account for private container storage.</w:t>
+      </w:r>
+    </w:p>
+    <w:p>
+      <w:pPr>
+        <w:pStyle w:val="Compact"/>
+        <w:numPr>
+          <w:ilvl w:val="0"/>
+          <w:numId w:val="1016"/>
+        </w:numPr>
+      </w:pPr>
+      <w:r>
+        <w:t xml:space="preserve">Integration of AWS Batch for executing workflows.</w:t>
+      </w:r>
+    </w:p>
+    <w:bookmarkEnd w:id="26"/>
+    <w:bookmarkStart w:id="27" w:name="X3e278339fcbf4b3ebfe3d679a109ad53edb5229"/>
+    <w:p>
+      <w:pPr>
+        <w:pStyle w:val="Heading4"/>
+      </w:pPr>
+      <w:r>
+        <w:t xml:space="preserve">2.2 Out-of-Scope</w:t>
       </w:r>
     </w:p>
     <w:p>
@@ -1253,17 +1425,29 @@
         </w:numPr>
       </w:pPr>
       <w:r>
-        <w:t xml:space="preserve">NA</w:t>
-      </w:r>
-    </w:p>
-    <w:bookmarkEnd w:id="36"/>
-    <w:bookmarkStart w:id="37" w:name="appendix-a"/>
-    <w:p>
-      <w:pPr>
-        <w:pStyle w:val="Heading2"/>
-      </w:pPr>
-      <w:r>
-        <w:t xml:space="preserve">Appendix A</w:t>
+        <w:t xml:space="preserve">External internet connectivity for GitLab or ECR.</w:t>
+      </w:r>
+    </w:p>
+    <w:p>
+      <w:pPr>
+        <w:pStyle w:val="Compact"/>
+        <w:numPr>
+          <w:ilvl w:val="0"/>
+          <w:numId w:val="1017"/>
+        </w:numPr>
+      </w:pPr>
+      <w:r>
+        <w:t xml:space="preserve">Support for third-party container registries.</w:t>
+      </w:r>
+    </w:p>
+    <w:bookmarkEnd w:id="27"/>
+    <w:bookmarkStart w:id="28" w:name="X1225254b529f3963918b9b22b4bc31d086c3c2a"/>
+    <w:p>
+      <w:pPr>
+        <w:pStyle w:val="Heading4"/>
+      </w:pPr>
+      <w:r>
+        <w:t xml:space="preserve">2.3 Assumptions and Dependencies</w:t>
       </w:r>
     </w:p>
     <w:p>
@@ -1275,10 +1459,378 @@
         </w:numPr>
       </w:pPr>
       <w:r>
+        <w:t xml:space="preserve">AWS GCC accounts are pre-configured with necessary permissions.</w:t>
+      </w:r>
+    </w:p>
+    <w:p>
+      <w:pPr>
+        <w:pStyle w:val="Compact"/>
+        <w:numPr>
+          <w:ilvl w:val="0"/>
+          <w:numId w:val="1018"/>
+        </w:numPr>
+      </w:pPr>
+      <w:r>
+        <w:t xml:space="preserve">CloudOS is deployed and functional in a closed environment.</w:t>
+      </w:r>
+    </w:p>
+    <w:bookmarkEnd w:id="28"/>
+    <w:bookmarkStart w:id="29" w:name="Xa7ab55827d5a3cec99a5ba301a1cc9f0fb99acd"/>
+    <w:p>
+      <w:pPr>
+        <w:pStyle w:val="Heading4"/>
+      </w:pPr>
+      <w:r>
+        <w:t xml:space="preserve">2.4 User Access</w:t>
+      </w:r>
+    </w:p>
+    <w:p>
+      <w:pPr>
+        <w:pStyle w:val="FirstParagraph"/>
+      </w:pPr>
+      <w:r>
+        <w:t xml:space="preserve">Researchers and engineers will have access to GitLab for version control via Commandline.</w:t>
+      </w:r>
+      <w:r>
+        <w:br/>
+      </w:r>
+      <w:r>
+        <w:t xml:space="preserve">AWS ECR will be accessible only within AWS GCC accounts via private networking.</w:t>
+      </w:r>
+    </w:p>
+    <w:p>
+      <w:r>
+        <w:pict>
+          <v:rect style="width:0;height:1.5pt" o:hralign="center" o:hrstd="t" o:hr="t"/>
+        </w:pict>
+      </w:r>
+    </w:p>
+    <w:bookmarkEnd w:id="29"/>
+    <w:bookmarkEnd w:id="30"/>
+    <w:bookmarkStart w:id="33" w:name="X9fefa8155db59920ddea2e905058bdaa884cb9b"/>
+    <w:p>
+      <w:pPr>
+        <w:pStyle w:val="Heading3"/>
+      </w:pPr>
+      <w:r>
+        <w:t xml:space="preserve">3. WORKFLOWS</w:t>
+      </w:r>
+    </w:p>
+    <w:bookmarkStart w:id="31" w:name="existing-or-as-is-process-workflow"/>
+    <w:p>
+      <w:pPr>
+        <w:pStyle w:val="Heading4"/>
+      </w:pPr>
+      <w:r>
+        <w:t xml:space="preserve">Existing or “As-Is” Process Workflow</w:t>
+      </w:r>
+    </w:p>
+    <w:p>
+      <w:pPr>
+        <w:pStyle w:val="FirstParagraph"/>
+      </w:pPr>
+      <w:r>
         <w:t xml:space="preserve">NA</w:t>
       </w:r>
     </w:p>
+    <w:bookmarkEnd w:id="31"/>
+    <w:bookmarkStart w:id="32" w:name="proposed-or-to-be-process-workflow"/>
+    <w:p>
+      <w:pPr>
+        <w:pStyle w:val="Heading4"/>
+      </w:pPr>
+      <w:r>
+        <w:t xml:space="preserve">Proposed or “To-Be” Process Workflow</w:t>
+      </w:r>
+    </w:p>
+    <w:p>
+      <w:pPr>
+        <w:pStyle w:val="FirstParagraph"/>
+      </w:pPr>
+      <w:r>
+        <w:t xml:space="preserve">NA</w:t>
+      </w:r>
+    </w:p>
+    <w:p>
+      <w:r>
+        <w:pict>
+          <v:rect style="width:0;height:1.5pt" o:hralign="center" o:hrstd="t" o:hr="t"/>
+        </w:pict>
+      </w:r>
+    </w:p>
+    <w:bookmarkEnd w:id="32"/>
+    <w:bookmarkEnd w:id="33"/>
+    <w:bookmarkStart w:id="37" w:name="X92af3177fcd7934be9e86f872d9396373c3b0fb"/>
+    <w:p>
+      <w:pPr>
+        <w:pStyle w:val="Heading3"/>
+      </w:pPr>
+      <w:r>
+        <w:t xml:space="preserve">4. FUNCTIONAL REQUIREMENTS</w:t>
+      </w:r>
+    </w:p>
+    <w:bookmarkStart w:id="34" w:name="Xa88d536192df1b0ba2502b0257f915341a5a977"/>
+    <w:p>
+      <w:pPr>
+        <w:pStyle w:val="Heading4"/>
+      </w:pPr>
+      <w:r>
+        <w:t xml:space="preserve">4.1 Statutory or Regulatory Requirements</w:t>
+      </w:r>
+    </w:p>
+    <w:p>
+      <w:pPr>
+        <w:pStyle w:val="FirstParagraph"/>
+      </w:pPr>
+      <w:r>
+        <w:t xml:space="preserve">NA</w:t>
+      </w:r>
+    </w:p>
+    <w:bookmarkEnd w:id="34"/>
+    <w:bookmarkStart w:id="35" w:name="X5825d88a53d3af6289aa14b2e2d95f3928c76b9"/>
+    <w:p>
+      <w:pPr>
+        <w:pStyle w:val="Heading4"/>
+      </w:pPr>
+      <w:r>
+        <w:t xml:space="preserve">4.2 &lt;Functional Requirement or Feature # 1&gt;</w:t>
+      </w:r>
+    </w:p>
+    <w:p>
+      <w:pPr>
+        <w:pStyle w:val="FirstParagraph"/>
+      </w:pPr>
+      <w:r>
+        <w:t xml:space="preserve">NA</w:t>
+      </w:r>
+    </w:p>
+    <w:bookmarkEnd w:id="35"/>
+    <w:bookmarkStart w:id="36" w:name="X5dbd7812828b3df687a62031172fd9231c4a76c"/>
+    <w:p>
+      <w:pPr>
+        <w:pStyle w:val="Heading4"/>
+      </w:pPr>
+      <w:r>
+        <w:t xml:space="preserve">4.3 &lt;Functional Requirement or Feature # 2&gt;</w:t>
+      </w:r>
+    </w:p>
+    <w:p>
+      <w:pPr>
+        <w:pStyle w:val="FirstParagraph"/>
+      </w:pPr>
+      <w:r>
+        <w:t xml:space="preserve">NA</w:t>
+      </w:r>
+    </w:p>
+    <w:p>
+      <w:r>
+        <w:pict>
+          <v:rect style="width:0;height:1.5pt" o:hralign="center" o:hrstd="t" o:hr="t"/>
+        </w:pict>
+      </w:r>
+    </w:p>
+    <w:bookmarkEnd w:id="36"/>
     <w:bookmarkEnd w:id="37"/>
+    <w:bookmarkStart w:id="38" w:name="X02a6657be6eec3c6380e168f0b809d230f51129"/>
+    <w:p>
+      <w:pPr>
+        <w:pStyle w:val="Heading3"/>
+      </w:pPr>
+      <w:r>
+        <w:t xml:space="preserve">5. DATA SETUP</w:t>
+      </w:r>
+    </w:p>
+    <w:p>
+      <w:pPr>
+        <w:pStyle w:val="FirstParagraph"/>
+      </w:pPr>
+      <w:r>
+        <w:t xml:space="preserve">NA</w:t>
+      </w:r>
+    </w:p>
+    <w:p>
+      <w:r>
+        <w:pict>
+          <v:rect style="width:0;height:1.5pt" o:hralign="center" o:hrstd="t" o:hr="t"/>
+        </w:pict>
+      </w:r>
+    </w:p>
+    <w:bookmarkEnd w:id="38"/>
+    <w:bookmarkStart w:id="39" w:name="Xe4b80c882149d6a003642a2ebb488d15822f9cb"/>
+    <w:p>
+      <w:pPr>
+        <w:pStyle w:val="Heading3"/>
+      </w:pPr>
+      <w:r>
+        <w:t xml:space="preserve">6. RECONCILIATION REPORTS</w:t>
+      </w:r>
+    </w:p>
+    <w:p>
+      <w:pPr>
+        <w:pStyle w:val="FirstParagraph"/>
+      </w:pPr>
+      <w:r>
+        <w:t xml:space="preserve">NA</w:t>
+      </w:r>
+    </w:p>
+    <w:p>
+      <w:r>
+        <w:pict>
+          <v:rect style="width:0;height:1.5pt" o:hralign="center" o:hrstd="t" o:hr="t"/>
+        </w:pict>
+      </w:r>
+    </w:p>
+    <w:bookmarkEnd w:id="39"/>
+    <w:bookmarkStart w:id="40" w:name="X40662a37f8cf1b43357287189d245b0ab90f12d"/>
+    <w:p>
+      <w:pPr>
+        <w:pStyle w:val="Heading3"/>
+      </w:pPr>
+      <w:r>
+        <w:t xml:space="preserve">7. BATCH JOBS</w:t>
+      </w:r>
+    </w:p>
+    <w:p>
+      <w:pPr>
+        <w:pStyle w:val="FirstParagraph"/>
+      </w:pPr>
+      <w:r>
+        <w:t xml:space="preserve">NA</w:t>
+      </w:r>
+    </w:p>
+    <w:p>
+      <w:r>
+        <w:pict>
+          <v:rect style="width:0;height:1.5pt" o:hralign="center" o:hrstd="t" o:hr="t"/>
+        </w:pict>
+      </w:r>
+    </w:p>
+    <w:bookmarkEnd w:id="40"/>
+    <w:bookmarkStart w:id="41" w:name="X951c2e607ae6f6485083a85cc02804449582836"/>
+    <w:p>
+      <w:pPr>
+        <w:pStyle w:val="Heading3"/>
+      </w:pPr>
+      <w:r>
+        <w:t xml:space="preserve">8. AUDIT LOGGING</w:t>
+      </w:r>
+    </w:p>
+    <w:p>
+      <w:pPr>
+        <w:pStyle w:val="FirstParagraph"/>
+      </w:pPr>
+      <w:r>
+        <w:t xml:space="preserve">NA</w:t>
+      </w:r>
+    </w:p>
+    <w:p>
+      <w:r>
+        <w:pict>
+          <v:rect style="width:0;height:1.5pt" o:hralign="center" o:hrstd="t" o:hr="t"/>
+        </w:pict>
+      </w:r>
+    </w:p>
+    <w:bookmarkEnd w:id="41"/>
+    <w:bookmarkStart w:id="42" w:name="X9b30ff48061a6a9bdb1c378f50d0ce7f9380322"/>
+    <w:p>
+      <w:pPr>
+        <w:pStyle w:val="Heading3"/>
+      </w:pPr>
+      <w:r>
+        <w:t xml:space="preserve">9. DATA MIGRATION REQUIREMENTS</w:t>
+      </w:r>
+    </w:p>
+    <w:p>
+      <w:pPr>
+        <w:pStyle w:val="FirstParagraph"/>
+      </w:pPr>
+      <w:r>
+        <w:t xml:space="preserve">NA</w:t>
+      </w:r>
+    </w:p>
+    <w:p>
+      <w:r>
+        <w:pict>
+          <v:rect style="width:0;height:1.5pt" o:hralign="center" o:hrstd="t" o:hr="t"/>
+        </w:pict>
+      </w:r>
+    </w:p>
+    <w:bookmarkEnd w:id="42"/>
+    <w:bookmarkStart w:id="43" w:name="X7ef406f34724aff923290b103d915d0b4c5a060"/>
+    <w:p>
+      <w:pPr>
+        <w:pStyle w:val="Heading3"/>
+      </w:pPr>
+      <w:r>
+        <w:t xml:space="preserve">10. INTERFACE REQUIREMENTS</w:t>
+      </w:r>
+    </w:p>
+    <w:p>
+      <w:pPr>
+        <w:pStyle w:val="FirstParagraph"/>
+      </w:pPr>
+      <w:r>
+        <w:t xml:space="preserve">NA</w:t>
+      </w:r>
+    </w:p>
+    <w:p>
+      <w:r>
+        <w:pict>
+          <v:rect style="width:0;height:1.5pt" o:hralign="center" o:hrstd="t" o:hr="t"/>
+        </w:pict>
+      </w:r>
+    </w:p>
+    <w:bookmarkEnd w:id="43"/>
+    <w:bookmarkStart w:id="44" w:name="X507a687eab8a609610926e4ca5c8ffdb4453760"/>
+    <w:p>
+      <w:pPr>
+        <w:pStyle w:val="Heading3"/>
+      </w:pPr>
+      <w:r>
+        <w:t xml:space="preserve">11. PERFORMANCE REQUIREMENTS</w:t>
+      </w:r>
+    </w:p>
+    <w:p>
+      <w:pPr>
+        <w:pStyle w:val="FirstParagraph"/>
+      </w:pPr>
+      <w:r>
+        <w:t xml:space="preserve">NA</w:t>
+      </w:r>
+    </w:p>
+    <w:p>
+      <w:r>
+        <w:pict>
+          <v:rect style="width:0;height:1.5pt" o:hralign="center" o:hrstd="t" o:hr="t"/>
+        </w:pict>
+      </w:r>
+    </w:p>
+    <w:bookmarkEnd w:id="44"/>
+    <w:bookmarkStart w:id="45" w:name="X8576292ca95116af11d725477ab16d3d523ebb7"/>
+    <w:p>
+      <w:pPr>
+        <w:pStyle w:val="Heading3"/>
+      </w:pPr>
+      <w:r>
+        <w:t xml:space="preserve">12. SUMMARY / RECOMMENDATIONS</w:t>
+      </w:r>
+    </w:p>
+    <w:p>
+      <w:pPr>
+        <w:pStyle w:val="FirstParagraph"/>
+      </w:pPr>
+      <w:r>
+        <w:t xml:space="preserve">NA</w:t>
+      </w:r>
+    </w:p>
+    <w:p>
+      <w:r>
+        <w:pict>
+          <v:rect style="width:0;height:1.5pt" o:hralign="center" o:hrstd="t" o:hr="t"/>
+        </w:pict>
+      </w:r>
+    </w:p>
+    <w:bookmarkEnd w:id="45"/>
     <w:sectPr>
       <w:headerReference r:id="rId9" w:type="default"/>
       <w:footerReference r:id="rId11" w:type="default"/>
@@ -3978,6 +4530,91 @@
       <w:rPr>
         <w:rFonts w:ascii="Wingdings" w:hAnsi="Wingdings" w:cs="Wingdings" w:hint="default"/>
       </w:rPr>
+    </w:lvl>
+  </w:abstractNum>
+  <w:abstractNum w:abstractNumId="994112">
+    <w:nsid w:val="0A994112"/>
+    <w:multiLevelType w:val="multilevel"/>
+    <w:lvl w:ilvl="0">
+      <w:start w:val="12"/>
+      <w:numFmt w:val="decimal"/>
+      <w:lvlText w:val="%1."/>
+      <w:lvlJc w:val="left"/>
+      <w:pPr>
+        <w:ind w:left="720" w:hanging="360"/>
+      </w:pPr>
+    </w:lvl>
+    <w:lvl w:ilvl="1">
+      <w:start w:val="12"/>
+      <w:numFmt w:val="decimal"/>
+      <w:lvlText w:val="%2."/>
+      <w:lvlJc w:val="left"/>
+      <w:pPr>
+        <w:ind w:left="1440" w:hanging="360"/>
+      </w:pPr>
+    </w:lvl>
+    <w:lvl w:ilvl="2">
+      <w:start w:val="12"/>
+      <w:numFmt w:val="decimal"/>
+      <w:lvlText w:val="%3."/>
+      <w:lvlJc w:val="left"/>
+      <w:pPr>
+        <w:ind w:left="2160" w:hanging="360"/>
+      </w:pPr>
+    </w:lvl>
+    <w:lvl w:ilvl="3">
+      <w:start w:val="12"/>
+      <w:numFmt w:val="decimal"/>
+      <w:lvlText w:val="%4."/>
+      <w:lvlJc w:val="left"/>
+      <w:pPr>
+        <w:ind w:left="2880" w:hanging="360"/>
+      </w:pPr>
+    </w:lvl>
+    <w:lvl w:ilvl="4">
+      <w:start w:val="12"/>
+      <w:numFmt w:val="decimal"/>
+      <w:lvlText w:val="%5."/>
+      <w:lvlJc w:val="left"/>
+      <w:pPr>
+        <w:ind w:left="3600" w:hanging="360"/>
+      </w:pPr>
+    </w:lvl>
+    <w:lvl w:ilvl="5">
+      <w:start w:val="12"/>
+      <w:numFmt w:val="decimal"/>
+      <w:lvlText w:val="%6."/>
+      <w:lvlJc w:val="left"/>
+      <w:pPr>
+        <w:ind w:left="4320" w:hanging="360"/>
+      </w:pPr>
+    </w:lvl>
+    <w:lvl w:ilvl="6">
+      <w:start w:val="12"/>
+      <w:numFmt w:val="decimal"/>
+      <w:lvlText w:val="%7."/>
+      <w:lvlJc w:val="left"/>
+      <w:pPr>
+        <w:ind w:left="5040" w:hanging="360"/>
+      </w:pPr>
+    </w:lvl>
+    <w:lvl w:ilvl="7">
+      <w:start w:val="12"/>
+      <w:numFmt w:val="decimal"/>
+      <w:lvlText w:val="%8."/>
+      <w:lvlJc w:val="left"/>
+      <w:pPr>
+        <w:ind w:left="5760" w:hanging="360"/>
+      </w:pPr>
+    </w:lvl>
+    <w:lvl w:ilvl="8">
+      <w:start w:val="12"/>
+      <w:numFmt w:val="decimal"/>
+      <w:lvlText w:val="%9."/>
+      <w:lvlJc w:val="left"/>
+      <w:pPr>
+        <w:ind w:left="6480" w:hanging="360"/>
+      </w:pPr>
     </w:lvl>
   </w:abstractNum>
   <w:num w16cid:durableId="488863413" w:numId="1">
@@ -4298,7 +4935,34 @@
     <w:abstractNumId w:val="991"/>
   </w:num>
   <w:num w:numId="1011">
-    <w:abstractNumId w:val="991"/>
+    <w:abstractNumId w:val="994112"/>
+    <w:lvlOverride w:ilvl="0">
+      <w:startOverride w:val="12"/>
+    </w:lvlOverride>
+    <w:lvlOverride w:ilvl="1">
+      <w:startOverride w:val="12"/>
+    </w:lvlOverride>
+    <w:lvlOverride w:ilvl="2">
+      <w:startOverride w:val="12"/>
+    </w:lvlOverride>
+    <w:lvlOverride w:ilvl="3">
+      <w:startOverride w:val="12"/>
+    </w:lvlOverride>
+    <w:lvlOverride w:ilvl="4">
+      <w:startOverride w:val="12"/>
+    </w:lvlOverride>
+    <w:lvlOverride w:ilvl="5">
+      <w:startOverride w:val="12"/>
+    </w:lvlOverride>
+    <w:lvlOverride w:ilvl="6">
+      <w:startOverride w:val="12"/>
+    </w:lvlOverride>
+    <w:lvlOverride w:ilvl="7">
+      <w:startOverride w:val="12"/>
+    </w:lvlOverride>
+    <w:lvlOverride w:ilvl="8">
+      <w:startOverride w:val="12"/>
+    </w:lvlOverride>
   </w:num>
   <w:num w:numId="1012">
     <w:abstractNumId w:val="991"/>

</xml_diff>

<commit_message>
REQ - Reviewing and improved
</commit_message>
<xml_diff>
--- a/docs/Requirement_Specification.docx
+++ b/docs/Requirement_Specification.docx
@@ -28,36 +28,10 @@
     </w:p>
     <w:p>
       <w:pPr>
-        <w:pStyle w:val="AbstractTitle"/>
-      </w:pPr>
-      <w:r>
-        <w:t xml:space="preserve">Abstract</w:t>
-      </w:r>
-    </w:p>
-    <w:p>
-      <w:pPr>
-        <w:pStyle w:val="Abstract"/>
-      </w:pPr>
-      <w:r>
-        <w:t xml:space="preserve">This document defines the requirement specifications for deploying code,</w:t>
-      </w:r>
-      <w:r>
-        <w:t xml:space="preserve"> </w:t>
-      </w:r>
-      <w:r>
-        <w:t xml:space="preserve">container repositories, and related cloud infrastructure in a non-internet</w:t>
-      </w:r>
-      <w:r>
-        <w:t xml:space="preserve"> </w:t>
-      </w:r>
-      <w:r>
-        <w:t xml:space="preserve">environment (Singapore GCC) for Lifebit CloudOS, focusing on enabling</w:t>
-      </w:r>
-      <w:r>
-        <w:t xml:space="preserve"> </w:t>
-      </w:r>
-      <w:r>
-        <w:t xml:space="preserve">private GitLab and AWS ECR usage.</w:t>
+        <w:pStyle w:val="Date"/>
+      </w:pPr>
+      <w:r>
+        <w:t xml:space="preserve">30 Nov 2024</w:t>
       </w:r>
     </w:p>
     <w:sdt>

</xml_diff>